<commit_message>
fix: corrige função de formatos de documento
</commit_message>
<xml_diff>
--- a/app/templates/docx/proposta_tecnica_comercial.docx
+++ b/app/templates/docx/proposta_tecnica_comercial.docx
@@ -2964,8 +2964,8 @@
         <w:tblLook w:val="0400" w:firstRow="0" w:lastRow="0" w:firstColumn="0" w:lastColumn="0" w:noHBand="0" w:noVBand="1"/>
       </w:tblPr>
       <w:tblGrid>
-        <w:gridCol w:w="7315"/>
-        <w:gridCol w:w="1179"/>
+        <w:gridCol w:w="6594"/>
+        <w:gridCol w:w="1900"/>
       </w:tblGrid>
       <w:tr>
         <w:trPr>
@@ -2974,7 +2974,7 @@
         </w:trPr>
         <w:tc>
           <w:tcPr>
-            <w:tcW w:w="7315" w:type="dxa"/>
+            <w:tcW w:w="6594" w:type="dxa"/>
             <w:vAlign w:val="center"/>
           </w:tcPr>
           <w:p>
@@ -3008,7 +3008,7 @@
         </w:tc>
         <w:tc>
           <w:tcPr>
-            <w:tcW w:w="1179" w:type="dxa"/>
+            <w:tcW w:w="1900" w:type="dxa"/>
           </w:tcPr>
           <w:p>
             <w:pPr>
@@ -3039,7 +3039,7 @@
         </w:trPr>
         <w:tc>
           <w:tcPr>
-            <w:tcW w:w="7315" w:type="dxa"/>
+            <w:tcW w:w="6594" w:type="dxa"/>
             <w:vAlign w:val="center"/>
           </w:tcPr>
           <w:p>
@@ -3055,7 +3055,7 @@
         </w:tc>
         <w:tc>
           <w:tcPr>
-            <w:tcW w:w="1179" w:type="dxa"/>
+            <w:tcW w:w="1900" w:type="dxa"/>
           </w:tcPr>
           <w:p>
             <w:pPr>
@@ -3074,7 +3074,7 @@
         </w:trPr>
         <w:tc>
           <w:tcPr>
-            <w:tcW w:w="7315" w:type="dxa"/>
+            <w:tcW w:w="6594" w:type="dxa"/>
             <w:vAlign w:val="center"/>
           </w:tcPr>
           <w:p>
@@ -3090,7 +3090,7 @@
         </w:tc>
         <w:tc>
           <w:tcPr>
-            <w:tcW w:w="1179" w:type="dxa"/>
+            <w:tcW w:w="1900" w:type="dxa"/>
           </w:tcPr>
           <w:p>
             <w:pPr>
@@ -3109,7 +3109,7 @@
         </w:trPr>
         <w:tc>
           <w:tcPr>
-            <w:tcW w:w="7315" w:type="dxa"/>
+            <w:tcW w:w="6594" w:type="dxa"/>
             <w:vAlign w:val="center"/>
           </w:tcPr>
           <w:p>
@@ -3125,7 +3125,7 @@
         </w:tc>
         <w:tc>
           <w:tcPr>
-            <w:tcW w:w="1179" w:type="dxa"/>
+            <w:tcW w:w="1900" w:type="dxa"/>
           </w:tcPr>
           <w:p>
             <w:pPr>
@@ -3144,7 +3144,7 @@
         </w:trPr>
         <w:tc>
           <w:tcPr>
-            <w:tcW w:w="7315" w:type="dxa"/>
+            <w:tcW w:w="6594" w:type="dxa"/>
             <w:vAlign w:val="center"/>
           </w:tcPr>
           <w:p>
@@ -3160,7 +3160,7 @@
         </w:tc>
         <w:tc>
           <w:tcPr>
-            <w:tcW w:w="1179" w:type="dxa"/>
+            <w:tcW w:w="1900" w:type="dxa"/>
           </w:tcPr>
           <w:p>
             <w:pPr>
@@ -3179,7 +3179,7 @@
         </w:trPr>
         <w:tc>
           <w:tcPr>
-            <w:tcW w:w="7315" w:type="dxa"/>
+            <w:tcW w:w="6594" w:type="dxa"/>
             <w:vAlign w:val="center"/>
           </w:tcPr>
           <w:p>
@@ -3195,7 +3195,7 @@
         </w:tc>
         <w:tc>
           <w:tcPr>
-            <w:tcW w:w="1179" w:type="dxa"/>
+            <w:tcW w:w="1900" w:type="dxa"/>
           </w:tcPr>
           <w:p>
             <w:pPr>
@@ -3214,7 +3214,7 @@
         </w:trPr>
         <w:tc>
           <w:tcPr>
-            <w:tcW w:w="7315" w:type="dxa"/>
+            <w:tcW w:w="6594" w:type="dxa"/>
             <w:vAlign w:val="center"/>
           </w:tcPr>
           <w:p>
@@ -3230,7 +3230,7 @@
         </w:tc>
         <w:tc>
           <w:tcPr>
-            <w:tcW w:w="1179" w:type="dxa"/>
+            <w:tcW w:w="1900" w:type="dxa"/>
           </w:tcPr>
           <w:p>
             <w:pPr>
@@ -3249,7 +3249,7 @@
         </w:trPr>
         <w:tc>
           <w:tcPr>
-            <w:tcW w:w="7315" w:type="dxa"/>
+            <w:tcW w:w="6594" w:type="dxa"/>
             <w:vAlign w:val="center"/>
           </w:tcPr>
           <w:p>
@@ -3265,7 +3265,7 @@
         </w:tc>
         <w:tc>
           <w:tcPr>
-            <w:tcW w:w="1179" w:type="dxa"/>
+            <w:tcW w:w="1900" w:type="dxa"/>
           </w:tcPr>
           <w:p>
             <w:pPr>

</xml_diff>

<commit_message>
fix: corrige numero de pagina na proposta
</commit_message>
<xml_diff>
--- a/app/templates/docx/proposta_tecnica_comercial.docx
+++ b/app/templates/docx/proposta_tecnica_comercial.docx
@@ -7001,7 +7001,6 @@
       <w:footerReference w:type="default" r:id="rId16"/>
       <w:pgSz w:w="11906" w:h="16838"/>
       <w:pgMar w:top="1417" w:right="1701" w:bottom="1417" w:left="1701" w:header="708" w:footer="708" w:gutter="0"/>
-      <w:pgNumType w:start="1"/>
       <w:cols w:space="720"/>
       <w:titlePg/>
     </w:sectPr>
@@ -7250,7 +7249,48 @@
                               <w:color w:val="0070C0"/>
                               <w:sz w:val="20"/>
                             </w:rPr>
-                            <w:t xml:space="preserve">Sistema de Gestão da Integrada - SGI | PAGE   </w:t>
+                            <w:t xml:space="preserve">Sistema de Gestão da Integrada - SGI | </w:t>
+                          </w:r>
+                          <w:r>
+                            <w:rPr>
+                              <w:rFonts w:ascii="Metropolis" w:eastAsia="Metropolis" w:hAnsi="Metropolis" w:cs="Metropolis"/>
+                              <w:color w:val="0070C0"/>
+                              <w:sz w:val="20"/>
+                            </w:rPr>
+                            <w:fldChar w:fldCharType="begin"/>
+                          </w:r>
+                          <w:r>
+                            <w:rPr>
+                              <w:rFonts w:ascii="Metropolis" w:eastAsia="Metropolis" w:hAnsi="Metropolis" w:cs="Metropolis"/>
+                              <w:color w:val="0070C0"/>
+                              <w:sz w:val="20"/>
+                            </w:rPr>
+                            <w:instrText xml:space="preserve"> PAGE </w:instrText>
+                          </w:r>
+                          <w:r>
+                            <w:rPr>
+                              <w:rFonts w:ascii="Metropolis" w:eastAsia="Metropolis" w:hAnsi="Metropolis" w:cs="Metropolis"/>
+                              <w:color w:val="0070C0"/>
+                              <w:sz w:val="20"/>
+                            </w:rPr>
+                            <w:fldChar w:fldCharType="separate"/>
+                          </w:r>
+                          <w:r>
+                            <w:rPr>
+                              <w:rFonts w:ascii="Metropolis" w:eastAsia="Metropolis" w:hAnsi="Metropolis" w:cs="Metropolis"/>
+                              <w:color w:val="0070C0"/>
+                              <w:sz w:val="20"/>
+                              <w:noProof/>
+                            </w:rPr>
+                            <w:t>1</w:t>
+                          </w:r>
+                          <w:r>
+                            <w:rPr>
+                              <w:rFonts w:ascii="Metropolis" w:eastAsia="Metropolis" w:hAnsi="Metropolis" w:cs="Metropolis"/>
+                              <w:color w:val="0070C0"/>
+                              <w:sz w:val="20"/>
+                            </w:rPr>
+                            <w:fldChar w:fldCharType="end"/>
                           </w:r>
                         </w:p>
                       </w:txbxContent>
@@ -7281,7 +7321,48 @@
                         <w:color w:val="0070C0"/>
                         <w:sz w:val="20"/>
                       </w:rPr>
-                      <w:t xml:space="preserve">Sistema de Gestão da Integrada - SGI | PAGE   </w:t>
+                      <w:t xml:space="preserve">Sistema de Gestão da Integrada - SGI | </w:t>
+                    </w:r>
+                    <w:r>
+                      <w:rPr>
+                        <w:rFonts w:ascii="Metropolis" w:eastAsia="Metropolis" w:hAnsi="Metropolis" w:cs="Metropolis"/>
+                        <w:color w:val="0070C0"/>
+                        <w:sz w:val="20"/>
+                      </w:rPr>
+                      <w:fldChar w:fldCharType="begin"/>
+                    </w:r>
+                    <w:r>
+                      <w:rPr>
+                        <w:rFonts w:ascii="Metropolis" w:eastAsia="Metropolis" w:hAnsi="Metropolis" w:cs="Metropolis"/>
+                        <w:color w:val="0070C0"/>
+                        <w:sz w:val="20"/>
+                      </w:rPr>
+                      <w:instrText xml:space="preserve"> PAGE </w:instrText>
+                    </w:r>
+                    <w:r>
+                      <w:rPr>
+                        <w:rFonts w:ascii="Metropolis" w:eastAsia="Metropolis" w:hAnsi="Metropolis" w:cs="Metropolis"/>
+                        <w:color w:val="0070C0"/>
+                        <w:sz w:val="20"/>
+                      </w:rPr>
+                      <w:fldChar w:fldCharType="separate"/>
+                    </w:r>
+                    <w:r>
+                      <w:rPr>
+                        <w:rFonts w:ascii="Metropolis" w:eastAsia="Metropolis" w:hAnsi="Metropolis" w:cs="Metropolis"/>
+                        <w:color w:val="0070C0"/>
+                        <w:sz w:val="20"/>
+                        <w:noProof/>
+                      </w:rPr>
+                      <w:t>1</w:t>
+                    </w:r>
+                    <w:r>
+                      <w:rPr>
+                        <w:rFonts w:ascii="Metropolis" w:eastAsia="Metropolis" w:hAnsi="Metropolis" w:cs="Metropolis"/>
+                        <w:color w:val="0070C0"/>
+                        <w:sz w:val="20"/>
+                      </w:rPr>
+                      <w:fldChar w:fldCharType="end"/>
                     </w:r>
                   </w:p>
                 </w:txbxContent>
@@ -7659,7 +7740,48 @@
                               <w:color w:val="0070C0"/>
                               <w:sz w:val="20"/>
                             </w:rPr>
-                            <w:t xml:space="preserve">Sistema de Gestão da Integrada - SGI | PAGE   </w:t>
+                            <w:t xml:space="preserve">Sistema de Gestão da Integrada - SGI | </w:t>
+                          </w:r>
+                          <w:r>
+                            <w:rPr>
+                              <w:rFonts w:ascii="Metropolis" w:eastAsia="Metropolis" w:hAnsi="Metropolis" w:cs="Metropolis"/>
+                              <w:color w:val="0070C0"/>
+                              <w:sz w:val="20"/>
+                            </w:rPr>
+                            <w:fldChar w:fldCharType="begin"/>
+                          </w:r>
+                          <w:r>
+                            <w:rPr>
+                              <w:rFonts w:ascii="Metropolis" w:eastAsia="Metropolis" w:hAnsi="Metropolis" w:cs="Metropolis"/>
+                              <w:color w:val="0070C0"/>
+                              <w:sz w:val="20"/>
+                            </w:rPr>
+                            <w:instrText xml:space="preserve"> PAGE </w:instrText>
+                          </w:r>
+                          <w:r>
+                            <w:rPr>
+                              <w:rFonts w:ascii="Metropolis" w:eastAsia="Metropolis" w:hAnsi="Metropolis" w:cs="Metropolis"/>
+                              <w:color w:val="0070C0"/>
+                              <w:sz w:val="20"/>
+                            </w:rPr>
+                            <w:fldChar w:fldCharType="separate"/>
+                          </w:r>
+                          <w:r>
+                            <w:rPr>
+                              <w:rFonts w:ascii="Metropolis" w:eastAsia="Metropolis" w:hAnsi="Metropolis" w:cs="Metropolis"/>
+                              <w:color w:val="0070C0"/>
+                              <w:sz w:val="20"/>
+                              <w:noProof/>
+                            </w:rPr>
+                            <w:t>1</w:t>
+                          </w:r>
+                          <w:r>
+                            <w:rPr>
+                              <w:rFonts w:ascii="Metropolis" w:eastAsia="Metropolis" w:hAnsi="Metropolis" w:cs="Metropolis"/>
+                              <w:color w:val="0070C0"/>
+                              <w:sz w:val="20"/>
+                            </w:rPr>
+                            <w:fldChar w:fldCharType="end"/>
                           </w:r>
                         </w:p>
                       </w:txbxContent>
@@ -7690,7 +7812,48 @@
                         <w:color w:val="0070C0"/>
                         <w:sz w:val="20"/>
                       </w:rPr>
-                      <w:t xml:space="preserve">Sistema de Gestão da Integrada - SGI | PAGE   </w:t>
+                      <w:t xml:space="preserve">Sistema de Gestão da Integrada - SGI | </w:t>
+                    </w:r>
+                    <w:r>
+                      <w:rPr>
+                        <w:rFonts w:ascii="Metropolis" w:eastAsia="Metropolis" w:hAnsi="Metropolis" w:cs="Metropolis"/>
+                        <w:color w:val="0070C0"/>
+                        <w:sz w:val="20"/>
+                      </w:rPr>
+                      <w:fldChar w:fldCharType="begin"/>
+                    </w:r>
+                    <w:r>
+                      <w:rPr>
+                        <w:rFonts w:ascii="Metropolis" w:eastAsia="Metropolis" w:hAnsi="Metropolis" w:cs="Metropolis"/>
+                        <w:color w:val="0070C0"/>
+                        <w:sz w:val="20"/>
+                      </w:rPr>
+                      <w:instrText xml:space="preserve"> PAGE </w:instrText>
+                    </w:r>
+                    <w:r>
+                      <w:rPr>
+                        <w:rFonts w:ascii="Metropolis" w:eastAsia="Metropolis" w:hAnsi="Metropolis" w:cs="Metropolis"/>
+                        <w:color w:val="0070C0"/>
+                        <w:sz w:val="20"/>
+                      </w:rPr>
+                      <w:fldChar w:fldCharType="separate"/>
+                    </w:r>
+                    <w:r>
+                      <w:rPr>
+                        <w:rFonts w:ascii="Metropolis" w:eastAsia="Metropolis" w:hAnsi="Metropolis" w:cs="Metropolis"/>
+                        <w:color w:val="0070C0"/>
+                        <w:sz w:val="20"/>
+                        <w:noProof/>
+                      </w:rPr>
+                      <w:t>1</w:t>
+                    </w:r>
+                    <w:r>
+                      <w:rPr>
+                        <w:rFonts w:ascii="Metropolis" w:eastAsia="Metropolis" w:hAnsi="Metropolis" w:cs="Metropolis"/>
+                        <w:color w:val="0070C0"/>
+                        <w:sz w:val="20"/>
+                      </w:rPr>
+                      <w:fldChar w:fldCharType="end"/>
                     </w:r>
                   </w:p>
                 </w:txbxContent>

</xml_diff>

<commit_message>
fix: corrige docx na parte de precificação
</commit_message>
<xml_diff>
--- a/app/templates/docx/proposta_tecnica_comercial.docx
+++ b/app/templates/docx/proposta_tecnica_comercial.docx
@@ -5409,7 +5409,7 @@
           <w:ilvl w:val="0"/>
           <w:numId w:val="1"/>
         </w:numPr>
-        <w:spacing w:before="0" w:after="0" w:line="360" w:lineRule="auto"/>
+        <w:spacing w:before="360" w:after="0" w:line="360" w:lineRule="auto"/>
         <w:ind w:left="0" w:hanging="11"/>
         <w:jc w:val="both"/>
         <w:rPr>
@@ -5476,15 +5476,6 @@
         </w:rPr>
         <w:t>.</w:t>
       </w:r>
-    </w:p>
-    <w:p>
-      <w:pPr>
-        <w:spacing w:after="0" w:line="360" w:lineRule="auto"/>
-        <w:jc w:val="both"/>
-        <w:rPr>
-          <w:rFonts w:ascii="Metropolis" w:eastAsia="Metropolis" w:hAnsi="Metropolis" w:cs="Metropolis"/>
-        </w:rPr>
-      </w:pPr>
     </w:p>
     <w:p>
       <w:pPr>
@@ -5549,8 +5540,8 @@
       </w:tblPr>
       <w:tblGrid>
         <w:gridCol w:w="501"/>
-        <w:gridCol w:w="4542"/>
-        <w:gridCol w:w="3402"/>
+        <w:gridCol w:w="5644"/>
+        <w:gridCol w:w="2300"/>
       </w:tblGrid>
       <w:tr>
         <w:trPr>
@@ -5594,7 +5585,7 @@
         </w:tc>
         <w:tc>
           <w:tcPr>
-            <w:tcW w:w="4542" w:type="dxa"/>
+            <w:tcW w:w="5644" w:type="dxa"/>
             <w:vAlign w:val="center"/>
           </w:tcPr>
           <w:p>
@@ -5621,7 +5612,7 @@
         </w:tc>
         <w:tc>
           <w:tcPr>
-            <w:tcW w:w="3402" w:type="dxa"/>
+            <w:tcW w:w="2300" w:type="dxa"/>
             <w:vAlign w:val="center"/>
           </w:tcPr>
           <w:p>
@@ -5678,7 +5669,7 @@
         </w:tc>
         <w:tc>
           <w:tcPr>
-            <w:tcW w:w="4542" w:type="dxa"/>
+            <w:tcW w:w="5644" w:type="dxa"/>
             <w:vAlign w:val="center"/>
           </w:tcPr>
           <w:p>
@@ -5694,7 +5685,7 @@
         </w:tc>
         <w:tc>
           <w:tcPr>
-            <w:tcW w:w="3402" w:type="dxa"/>
+            <w:tcW w:w="2300" w:type="dxa"/>
             <w:vAlign w:val="center"/>
           </w:tcPr>
           <w:p>
@@ -5720,7 +5711,7 @@
           <w:right w:val="nil"/>
           <w:between w:val="nil"/>
         </w:pBdr>
-        <w:spacing w:after="0" w:line="360" w:lineRule="auto"/>
+        <w:spacing w:before="240" w:after="0" w:line="360" w:lineRule="auto"/>
         <w:jc w:val="both"/>
         <w:rPr>
           <w:rFonts w:ascii="Metropolis" w:eastAsia="Metropolis" w:hAnsi="Metropolis" w:cs="Metropolis"/>
@@ -5765,8 +5756,9 @@
       </w:tblPr>
       <w:tblGrid>
         <w:gridCol w:w="501"/>
-        <w:gridCol w:w="4542"/>
-        <w:gridCol w:w="3402"/>
+        <w:gridCol w:w="4242"/>
+        <w:gridCol w:w="1400"/>
+        <w:gridCol w:w="2302"/>
       </w:tblGrid>
       <w:tr>
         <w:trPr>
@@ -5810,7 +5802,7 @@
         </w:tc>
         <w:tc>
           <w:tcPr>
-            <w:tcW w:w="4542" w:type="dxa"/>
+            <w:tcW w:w="4242" w:type="dxa"/>
             <w:vAlign w:val="center"/>
           </w:tcPr>
           <w:p>
@@ -5837,7 +5829,7 @@
         </w:tc>
         <w:tc>
           <w:tcPr>
-            <w:tcW w:w="3402" w:type="dxa"/>
+            <w:tcW w:w="1400" w:type="dxa"/>
             <w:vAlign w:val="center"/>
           </w:tcPr>
           <w:p>
@@ -5858,7 +5850,34 @@
                 <w:sz w:val="20"/>
                 <w:szCs w:val="20"/>
               </w:rPr>
-              <w:t>% DO ITEM</w:t>
+              <w:t>%</w:t>
+            </w:r>
+          </w:p>
+        </w:tc>
+        <w:tc>
+          <w:tcPr>
+            <w:tcW w:w="2302" w:type="dxa"/>
+            <w:vAlign w:val="center"/>
+          </w:tcPr>
+          <w:p>
+            <w:pPr>
+              <w:spacing w:after="0" w:line="360" w:lineRule="auto"/>
+              <w:jc w:val="center"/>
+              <w:rPr>
+                <w:rFonts w:ascii="Metropolis" w:eastAsia="Metropolis" w:hAnsi="Metropolis" w:cs="Metropolis"/>
+                <w:b/>
+                <w:sz w:val="20"/>
+                <w:szCs w:val="20"/>
+              </w:rPr>
+            </w:pPr>
+            <w:r>
+              <w:rPr>
+                <w:rFonts w:ascii="Metropolis" w:eastAsia="Metropolis" w:hAnsi="Metropolis" w:cs="Metropolis"/>
+                <w:b/>
+                <w:sz w:val="20"/>
+                <w:szCs w:val="20"/>
+              </w:rPr>
+              <w:t>VALOR R$</w:t>
             </w:r>
           </w:p>
         </w:tc>
@@ -5874,7 +5893,7 @@
           </w:tcPr>
           <w:p>
             <w:pPr>
-              <w:spacing w:after="0" w:line="360" w:lineRule="auto"/>
+              <w:spacing w:after="0"/>
               <w:jc w:val="center"/>
               <w:rPr>
                 <w:rFonts w:ascii="Metropolis" w:eastAsia="Metropolis" w:hAnsi="Metropolis" w:cs="Metropolis"/>
@@ -5894,7 +5913,7 @@
         </w:tc>
         <w:tc>
           <w:tcPr>
-            <w:tcW w:w="4542" w:type="dxa"/>
+            <w:tcW w:w="4242" w:type="dxa"/>
             <w:vAlign w:val="center"/>
           </w:tcPr>
           <w:p>
@@ -5910,7 +5929,24 @@
         </w:tc>
         <w:tc>
           <w:tcPr>
-            <w:tcW w:w="3402" w:type="dxa"/>
+            <w:tcW w:w="1400" w:type="dxa"/>
+            <w:vAlign w:val="center"/>
+          </w:tcPr>
+          <w:p>
+            <w:pPr>
+              <w:spacing w:after="0"/>
+              <w:jc w:val="center"/>
+              <w:rPr>
+                <w:rFonts w:ascii="Metropolis" w:eastAsia="Metropolis" w:hAnsi="Metropolis" w:cs="Metropolis"/>
+                <w:sz w:val="20"/>
+                <w:szCs w:val="20"/>
+              </w:rPr>
+            </w:pPr>
+          </w:p>
+        </w:tc>
+        <w:tc>
+          <w:tcPr>
+            <w:tcW w:w="2302" w:type="dxa"/>
             <w:vAlign w:val="center"/>
           </w:tcPr>
           <w:p>
@@ -5937,7 +5973,7 @@
           </w:tcPr>
           <w:p>
             <w:pPr>
-              <w:spacing w:after="0" w:line="360" w:lineRule="auto"/>
+              <w:spacing w:after="0"/>
               <w:jc w:val="center"/>
               <w:rPr>
                 <w:rFonts w:ascii="Metropolis" w:eastAsia="Metropolis" w:hAnsi="Metropolis" w:cs="Metropolis"/>
@@ -5957,7 +5993,7 @@
         </w:tc>
         <w:tc>
           <w:tcPr>
-            <w:tcW w:w="4542" w:type="dxa"/>
+            <w:tcW w:w="4242" w:type="dxa"/>
             <w:vAlign w:val="center"/>
           </w:tcPr>
           <w:p>
@@ -5973,7 +6009,24 @@
         </w:tc>
         <w:tc>
           <w:tcPr>
-            <w:tcW w:w="3402" w:type="dxa"/>
+            <w:tcW w:w="1400" w:type="dxa"/>
+            <w:vAlign w:val="center"/>
+          </w:tcPr>
+          <w:p>
+            <w:pPr>
+              <w:spacing w:after="0"/>
+              <w:jc w:val="center"/>
+              <w:rPr>
+                <w:rFonts w:ascii="Metropolis" w:eastAsia="Metropolis" w:hAnsi="Metropolis" w:cs="Metropolis"/>
+                <w:sz w:val="20"/>
+                <w:szCs w:val="20"/>
+              </w:rPr>
+            </w:pPr>
+          </w:p>
+        </w:tc>
+        <w:tc>
+          <w:tcPr>
+            <w:tcW w:w="2302" w:type="dxa"/>
             <w:vAlign w:val="center"/>
           </w:tcPr>
           <w:p>
@@ -6000,7 +6053,7 @@
           </w:tcPr>
           <w:p>
             <w:pPr>
-              <w:spacing w:after="0" w:line="360" w:lineRule="auto"/>
+              <w:spacing w:after="0"/>
               <w:jc w:val="center"/>
               <w:rPr>
                 <w:rFonts w:ascii="Metropolis" w:eastAsia="Metropolis" w:hAnsi="Metropolis" w:cs="Metropolis"/>
@@ -6020,7 +6073,7 @@
         </w:tc>
         <w:tc>
           <w:tcPr>
-            <w:tcW w:w="4542" w:type="dxa"/>
+            <w:tcW w:w="4242" w:type="dxa"/>
             <w:vAlign w:val="center"/>
           </w:tcPr>
           <w:p>
@@ -6036,7 +6089,24 @@
         </w:tc>
         <w:tc>
           <w:tcPr>
-            <w:tcW w:w="3402" w:type="dxa"/>
+            <w:tcW w:w="1400" w:type="dxa"/>
+            <w:vAlign w:val="center"/>
+          </w:tcPr>
+          <w:p>
+            <w:pPr>
+              <w:spacing w:after="0"/>
+              <w:jc w:val="center"/>
+              <w:rPr>
+                <w:rFonts w:ascii="Metropolis" w:eastAsia="Metropolis" w:hAnsi="Metropolis" w:cs="Metropolis"/>
+                <w:sz w:val="20"/>
+                <w:szCs w:val="20"/>
+              </w:rPr>
+            </w:pPr>
+          </w:p>
+        </w:tc>
+        <w:tc>
+          <w:tcPr>
+            <w:tcW w:w="2302" w:type="dxa"/>
             <w:vAlign w:val="center"/>
           </w:tcPr>
           <w:p>
@@ -6063,7 +6133,7 @@
           </w:tcPr>
           <w:p>
             <w:pPr>
-              <w:spacing w:after="0" w:line="360" w:lineRule="auto"/>
+              <w:spacing w:after="0"/>
               <w:jc w:val="center"/>
               <w:rPr>
                 <w:rFonts w:ascii="Metropolis" w:eastAsia="Metropolis" w:hAnsi="Metropolis" w:cs="Metropolis"/>
@@ -6083,7 +6153,7 @@
         </w:tc>
         <w:tc>
           <w:tcPr>
-            <w:tcW w:w="4542" w:type="dxa"/>
+            <w:tcW w:w="4242" w:type="dxa"/>
             <w:vAlign w:val="center"/>
           </w:tcPr>
           <w:p>
@@ -6099,7 +6169,24 @@
         </w:tc>
         <w:tc>
           <w:tcPr>
-            <w:tcW w:w="3402" w:type="dxa"/>
+            <w:tcW w:w="1400" w:type="dxa"/>
+            <w:vAlign w:val="center"/>
+          </w:tcPr>
+          <w:p>
+            <w:pPr>
+              <w:spacing w:after="0"/>
+              <w:jc w:val="center"/>
+              <w:rPr>
+                <w:rFonts w:ascii="Metropolis" w:eastAsia="Metropolis" w:hAnsi="Metropolis" w:cs="Metropolis"/>
+                <w:sz w:val="20"/>
+                <w:szCs w:val="20"/>
+              </w:rPr>
+            </w:pPr>
+          </w:p>
+        </w:tc>
+        <w:tc>
+          <w:tcPr>
+            <w:tcW w:w="2302" w:type="dxa"/>
             <w:vAlign w:val="center"/>
           </w:tcPr>
           <w:p>
@@ -6126,7 +6213,7 @@
           </w:tcPr>
           <w:p>
             <w:pPr>
-              <w:spacing w:after="0" w:line="360" w:lineRule="auto"/>
+              <w:spacing w:after="0"/>
               <w:jc w:val="center"/>
               <w:rPr>
                 <w:rFonts w:ascii="Metropolis" w:eastAsia="Metropolis" w:hAnsi="Metropolis" w:cs="Metropolis"/>
@@ -6146,7 +6233,7 @@
         </w:tc>
         <w:tc>
           <w:tcPr>
-            <w:tcW w:w="4542" w:type="dxa"/>
+            <w:tcW w:w="4242" w:type="dxa"/>
             <w:vAlign w:val="center"/>
           </w:tcPr>
           <w:p>
@@ -6163,7 +6250,25 @@
         </w:tc>
         <w:tc>
           <w:tcPr>
-            <w:tcW w:w="3402" w:type="dxa"/>
+            <w:tcW w:w="1400" w:type="dxa"/>
+            <w:vAlign w:val="center"/>
+          </w:tcPr>
+          <w:p>
+            <w:pPr>
+              <w:spacing w:after="0"/>
+              <w:jc w:val="center"/>
+              <w:rPr>
+                <w:rFonts w:ascii="Metropolis" w:eastAsia="Metropolis" w:hAnsi="Metropolis" w:cs="Metropolis"/>
+                <w:color w:val="000000"/>
+                <w:sz w:val="20"/>
+                <w:szCs w:val="20"/>
+              </w:rPr>
+            </w:pPr>
+          </w:p>
+        </w:tc>
+        <w:tc>
+          <w:tcPr>
+            <w:tcW w:w="2302" w:type="dxa"/>
             <w:vAlign w:val="center"/>
           </w:tcPr>
           <w:p>
@@ -6191,7 +6296,7 @@
           </w:tcPr>
           <w:p>
             <w:pPr>
-              <w:spacing w:after="0" w:line="360" w:lineRule="auto"/>
+              <w:spacing w:after="0"/>
               <w:jc w:val="center"/>
               <w:rPr>
                 <w:rFonts w:ascii="Metropolis" w:eastAsia="Metropolis" w:hAnsi="Metropolis" w:cs="Metropolis"/>
@@ -6211,7 +6316,7 @@
         </w:tc>
         <w:tc>
           <w:tcPr>
-            <w:tcW w:w="4542" w:type="dxa"/>
+            <w:tcW w:w="4242" w:type="dxa"/>
             <w:vAlign w:val="center"/>
           </w:tcPr>
           <w:p>
@@ -6228,7 +6333,25 @@
         </w:tc>
         <w:tc>
           <w:tcPr>
-            <w:tcW w:w="3402" w:type="dxa"/>
+            <w:tcW w:w="1400" w:type="dxa"/>
+            <w:vAlign w:val="center"/>
+          </w:tcPr>
+          <w:p>
+            <w:pPr>
+              <w:spacing w:after="0"/>
+              <w:jc w:val="center"/>
+              <w:rPr>
+                <w:rFonts w:ascii="Metropolis" w:eastAsia="Metropolis" w:hAnsi="Metropolis" w:cs="Metropolis"/>
+                <w:color w:val="000000"/>
+                <w:sz w:val="20"/>
+                <w:szCs w:val="20"/>
+              </w:rPr>
+            </w:pPr>
+          </w:p>
+        </w:tc>
+        <w:tc>
+          <w:tcPr>
+            <w:tcW w:w="2302" w:type="dxa"/>
             <w:vAlign w:val="center"/>
           </w:tcPr>
           <w:p>
@@ -6256,7 +6379,7 @@
           </w:tcPr>
           <w:p>
             <w:pPr>
-              <w:spacing w:after="0" w:line="360" w:lineRule="auto"/>
+              <w:spacing w:after="0"/>
               <w:jc w:val="center"/>
               <w:rPr>
                 <w:rFonts w:ascii="Metropolis" w:eastAsia="Metropolis" w:hAnsi="Metropolis" w:cs="Metropolis"/>
@@ -6276,7 +6399,7 @@
         </w:tc>
         <w:tc>
           <w:tcPr>
-            <w:tcW w:w="4542" w:type="dxa"/>
+            <w:tcW w:w="4242" w:type="dxa"/>
             <w:vAlign w:val="center"/>
           </w:tcPr>
           <w:p>
@@ -6293,7 +6416,25 @@
         </w:tc>
         <w:tc>
           <w:tcPr>
-            <w:tcW w:w="3402" w:type="dxa"/>
+            <w:tcW w:w="1400" w:type="dxa"/>
+            <w:vAlign w:val="center"/>
+          </w:tcPr>
+          <w:p>
+            <w:pPr>
+              <w:spacing w:after="0"/>
+              <w:jc w:val="center"/>
+              <w:rPr>
+                <w:rFonts w:ascii="Metropolis" w:eastAsia="Metropolis" w:hAnsi="Metropolis" w:cs="Metropolis"/>
+                <w:color w:val="000000"/>
+                <w:sz w:val="20"/>
+                <w:szCs w:val="20"/>
+              </w:rPr>
+            </w:pPr>
+          </w:p>
+        </w:tc>
+        <w:tc>
+          <w:tcPr>
+            <w:tcW w:w="2302" w:type="dxa"/>
             <w:vAlign w:val="center"/>
           </w:tcPr>
           <w:p>
@@ -6321,7 +6462,7 @@
           </w:tcPr>
           <w:p>
             <w:pPr>
-              <w:spacing w:after="0" w:line="360" w:lineRule="auto"/>
+              <w:spacing w:after="0"/>
               <w:jc w:val="center"/>
               <w:rPr>
                 <w:rFonts w:ascii="Metropolis" w:eastAsia="Metropolis" w:hAnsi="Metropolis" w:cs="Metropolis"/>
@@ -6341,7 +6482,7 @@
         </w:tc>
         <w:tc>
           <w:tcPr>
-            <w:tcW w:w="4542" w:type="dxa"/>
+            <w:tcW w:w="4242" w:type="dxa"/>
             <w:vAlign w:val="center"/>
           </w:tcPr>
           <w:p>
@@ -6358,7 +6499,25 @@
         </w:tc>
         <w:tc>
           <w:tcPr>
-            <w:tcW w:w="3402" w:type="dxa"/>
+            <w:tcW w:w="1400" w:type="dxa"/>
+            <w:vAlign w:val="center"/>
+          </w:tcPr>
+          <w:p>
+            <w:pPr>
+              <w:spacing w:after="0"/>
+              <w:jc w:val="center"/>
+              <w:rPr>
+                <w:rFonts w:ascii="Metropolis" w:eastAsia="Metropolis" w:hAnsi="Metropolis" w:cs="Metropolis"/>
+                <w:color w:val="000000"/>
+                <w:sz w:val="20"/>
+                <w:szCs w:val="20"/>
+              </w:rPr>
+            </w:pPr>
+          </w:p>
+        </w:tc>
+        <w:tc>
+          <w:tcPr>
+            <w:tcW w:w="2302" w:type="dxa"/>
             <w:vAlign w:val="center"/>
           </w:tcPr>
           <w:p>
@@ -6386,7 +6545,7 @@
           </w:tcPr>
           <w:p>
             <w:pPr>
-              <w:spacing w:after="0" w:line="360" w:lineRule="auto"/>
+              <w:spacing w:after="0"/>
               <w:jc w:val="center"/>
               <w:rPr>
                 <w:rFonts w:ascii="Metropolis" w:eastAsia="Metropolis" w:hAnsi="Metropolis" w:cs="Metropolis"/>
@@ -6406,7 +6565,7 @@
         </w:tc>
         <w:tc>
           <w:tcPr>
-            <w:tcW w:w="4542" w:type="dxa"/>
+            <w:tcW w:w="4242" w:type="dxa"/>
             <w:vAlign w:val="center"/>
           </w:tcPr>
           <w:p>
@@ -6423,7 +6582,25 @@
         </w:tc>
         <w:tc>
           <w:tcPr>
-            <w:tcW w:w="3402" w:type="dxa"/>
+            <w:tcW w:w="1400" w:type="dxa"/>
+            <w:vAlign w:val="center"/>
+          </w:tcPr>
+          <w:p>
+            <w:pPr>
+              <w:spacing w:after="0"/>
+              <w:jc w:val="center"/>
+              <w:rPr>
+                <w:rFonts w:ascii="Metropolis" w:eastAsia="Metropolis" w:hAnsi="Metropolis" w:cs="Metropolis"/>
+                <w:color w:val="000000"/>
+                <w:sz w:val="20"/>
+                <w:szCs w:val="20"/>
+              </w:rPr>
+            </w:pPr>
+          </w:p>
+        </w:tc>
+        <w:tc>
+          <w:tcPr>
+            <w:tcW w:w="2302" w:type="dxa"/>
             <w:vAlign w:val="center"/>
           </w:tcPr>
           <w:p>
@@ -6450,7 +6627,7 @@
           <w:right w:val="nil"/>
           <w:between w:val="nil"/>
         </w:pBdr>
-        <w:spacing w:after="0" w:line="360" w:lineRule="auto"/>
+        <w:spacing w:before="240" w:after="0" w:line="360" w:lineRule="auto"/>
         <w:jc w:val="both"/>
         <w:rPr>
           <w:rFonts w:ascii="Metropolis" w:eastAsia="Metropolis" w:hAnsi="Metropolis" w:cs="Metropolis"/>

</xml_diff>

<commit_message>
fix: corrige funções de formatação de texto
</commit_message>
<xml_diff>
--- a/app/templates/docx/proposta_tecnica_comercial.docx
+++ b/app/templates/docx/proposta_tecnica_comercial.docx
@@ -1684,14 +1684,12 @@
         <w:rPr>
           <w:rFonts w:ascii="Metropolis" w:eastAsia="Metropolis" w:hAnsi="Metropolis" w:cs="Metropolis"/>
           <w:b/>
-          <w:smallCaps/>
         </w:rPr>
       </w:pPr>
       <w:r>
         <w:rPr>
           <w:rFonts w:ascii="Metropolis" w:eastAsia="Metropolis" w:hAnsi="Metropolis" w:cs="Metropolis"/>
           <w:b/>
-          <w:smallCaps/>
         </w:rPr>
         <w:t>{{NOME_CLIENTE}}</w:t>
       </w:r>
@@ -1716,7 +1714,7 @@
           <w:rFonts w:ascii="Metropolis" w:eastAsia="Metropolis" w:hAnsi="Metropolis" w:cs="Metropolis"/>
           <w:color w:val="000000"/>
         </w:rPr>
-        <w:t>Att.: Sr. {{CONTATO_CLIENTE}}</w:t>
+        <w:t>Att.: {{CONTATO_CLIENTE}}</w:t>
       </w:r>
     </w:p>
     <w:p>
@@ -1800,7 +1798,7 @@
           <w:rFonts w:ascii="Metropolis" w:eastAsia="Metropolis" w:hAnsi="Metropolis" w:cs="Metropolis"/>
           <w:color w:val="000000"/>
         </w:rPr>
-        <w:t xml:space="preserve">Prezado Sr., </w:t>
+        <w:t xml:space="preserve">{{SAUDACAO}}, </w:t>
       </w:r>
     </w:p>
     <w:p>

</xml_diff>

<commit_message>
fix: corrige formatação do documento como solicitado
</commit_message>
<xml_diff>
--- a/app/templates/docx/proposta_tecnica_comercial.docx
+++ b/app/templates/docx/proposta_tecnica_comercial.docx
@@ -3385,7 +3385,7 @@
         <w:rPr>
           <w:rFonts w:ascii="Metropolis" w:eastAsia="Metropolis" w:hAnsi="Metropolis" w:cs="Metropolis"/>
         </w:rPr>
-        <w:t xml:space="preserve">Caso sejam solicitados serviços e estudos não contemplados nesta proposta, estes serão objeto de proposta complementar.</w:t>
+        <w:t xml:space="preserve">Caso sejam solicitados serviços e estudos não contemplados neste documento, estes serão objeto de proposta complementar.</w:t>
       </w:r>
     </w:p>
     <w:p>
@@ -4247,10 +4247,10 @@
         <w:tblLook w:val="0000" w:firstRow="0" w:lastRow="0" w:firstColumn="0" w:lastColumn="0" w:noHBand="0" w:noVBand="0"/>
       </w:tblPr>
       <w:tblGrid>
-        <w:gridCol w:w="2177"/>
-        <w:gridCol w:w="1643"/>
-        <w:gridCol w:w="1725"/>
-        <w:gridCol w:w="2949"/>
+        <w:gridCol w:w="1293"/>
+        <w:gridCol w:w="1724"/>
+        <w:gridCol w:w="2003"/>
+        <w:gridCol w:w="3474"/>
       </w:tblGrid>
       <w:tr>
         <w:trPr>
@@ -4259,7 +4259,7 @@
         </w:trPr>
         <w:tc>
           <w:tcPr>
-            <w:tcW w:w="2177" w:type="dxa"/>
+            <w:tcW w:w="1293" w:type="dxa"/>
             <w:vAlign w:val="center"/>
           </w:tcPr>
           <w:p>
@@ -4289,13 +4289,13 @@
                 <w:sz w:val="20"/>
                 <w:szCs w:val="20"/>
               </w:rPr>
-              <w:t>SETOR/PROGRAMA</w:t>
+              <w:t>SETOR</w:t>
             </w:r>
           </w:p>
         </w:tc>
         <w:tc>
           <w:tcPr>
-            <w:tcW w:w="1643" w:type="dxa"/>
+            <w:tcW w:w="1724" w:type="dxa"/>
             <w:vAlign w:val="center"/>
           </w:tcPr>
           <w:p>
@@ -4331,7 +4331,7 @@
         </w:tc>
         <w:tc>
           <w:tcPr>
-            <w:tcW w:w="1725" w:type="dxa"/>
+            <w:tcW w:w="2003" w:type="dxa"/>
             <w:vAlign w:val="center"/>
           </w:tcPr>
           <w:p>
@@ -4367,7 +4367,7 @@
         </w:tc>
         <w:tc>
           <w:tcPr>
-            <w:tcW w:w="2949" w:type="dxa"/>
+            <w:tcW w:w="3474" w:type="dxa"/>
             <w:vAlign w:val="center"/>
           </w:tcPr>
           <w:p>
@@ -4408,7 +4408,7 @@
         </w:trPr>
         <w:tc>
           <w:tcPr>
-            <w:tcW w:w="2177" w:type="dxa"/>
+            <w:tcW w:w="1293" w:type="dxa"/>
             <w:vAlign w:val="center"/>
           </w:tcPr>
           <w:p>
@@ -4442,7 +4442,7 @@
         </w:tc>
         <w:tc>
           <w:tcPr>
-            <w:tcW w:w="1643" w:type="dxa"/>
+            <w:tcW w:w="1724" w:type="dxa"/>
             <w:vAlign w:val="center"/>
           </w:tcPr>
           <w:p>
@@ -4476,7 +4476,7 @@
         </w:tc>
         <w:tc>
           <w:tcPr>
-            <w:tcW w:w="1725" w:type="dxa"/>
+            <w:tcW w:w="2003" w:type="dxa"/>
             <w:vAlign w:val="center"/>
           </w:tcPr>
           <w:p>
@@ -4510,7 +4510,7 @@
         </w:tc>
         <w:tc>
           <w:tcPr>
-            <w:tcW w:w="2949" w:type="dxa"/>
+            <w:tcW w:w="3474" w:type="dxa"/>
             <w:vAlign w:val="center"/>
           </w:tcPr>
           <w:p>
@@ -6873,6 +6873,134 @@
           <w:color w:val="000000"/>
         </w:rPr>
         <w:t>BANCO ITAU/ AG: 8270/ C/C: 99308-5</w:t>
+      </w:r>
+    </w:p>
+    <w:p>
+      <w:pPr>
+        <w:pBdr>
+          <w:top w:val="nil"/>
+          <w:left w:val="nil"/>
+          <w:bottom w:val="nil"/>
+          <w:right w:val="nil"/>
+          <w:between w:val="nil"/>
+        </w:pBdr>
+        <w:spacing w:after="0" w:line="360" w:lineRule="auto"/>
+        <w:jc w:val="both"/>
+        <w:rPr>
+          <w:rFonts w:ascii="Metropolis" w:eastAsia="Metropolis" w:hAnsi="Metropolis" w:cs="Metropolis"/>
+          <w:color w:val="000000"/>
+        </w:rPr>
+      </w:pPr>
+    </w:p>
+    <w:p>
+      <w:pPr>
+        <w:pStyle w:val="Ttulo1"/>
+        <w:numPr>
+          <w:ilvl w:val="0"/>
+          <w:numId w:val="1"/>
+        </w:numPr>
+        <w:spacing w:before="0" w:after="0" w:line="360" w:lineRule="auto"/>
+        <w:ind w:left="0" w:hanging="11"/>
+        <w:jc w:val="both"/>
+        <w:rPr>
+          <w:rFonts w:ascii="Metropolis" w:eastAsia="Metropolis" w:hAnsi="Metropolis" w:cs="Metropolis"/>
+          <w:sz w:val="22"/>
+          <w:szCs w:val="22"/>
+        </w:rPr>
+      </w:pPr>
+      <w:r>
+        <w:rPr>
+          <w:rFonts w:ascii="Metropolis" w:eastAsia="Metropolis" w:hAnsi="Metropolis" w:cs="Metropolis"/>
+          <w:sz w:val="22"/>
+          <w:szCs w:val="22"/>
+        </w:rPr>
+        <w:lastRenderedPageBreak/>
+        <w:t>VALIDADE DA PROPOSTA</w:t>
+      </w:r>
+    </w:p>
+    <w:p>
+      <w:pPr>
+        <w:pBdr>
+          <w:top w:val="nil"/>
+          <w:left w:val="nil"/>
+          <w:bottom w:val="nil"/>
+          <w:right w:val="nil"/>
+          <w:between w:val="nil"/>
+        </w:pBdr>
+        <w:spacing w:after="0" w:line="360" w:lineRule="auto"/>
+        <w:jc w:val="both"/>
+        <w:rPr>
+          <w:rFonts w:ascii="Metropolis" w:eastAsia="Metropolis" w:hAnsi="Metropolis" w:cs="Metropolis"/>
+          <w:color w:val="000000"/>
+        </w:rPr>
+      </w:pPr>
+    </w:p>
+    <w:p>
+      <w:pPr>
+        <w:pBdr>
+          <w:top w:val="nil"/>
+          <w:left w:val="nil"/>
+          <w:bottom w:val="nil"/>
+          <w:right w:val="nil"/>
+          <w:between w:val="nil"/>
+        </w:pBdr>
+        <w:spacing w:after="0" w:line="360" w:lineRule="auto"/>
+        <w:jc w:val="both"/>
+        <w:rPr>
+          <w:rFonts w:ascii="Metropolis" w:eastAsia="Metropolis" w:hAnsi="Metropolis" w:cs="Metropolis"/>
+          <w:color w:val="000000"/>
+        </w:rPr>
+      </w:pPr>
+      <w:r>
+        <w:rPr>
+          <w:rFonts w:ascii="Metropolis" w:eastAsia="Metropolis" w:hAnsi="Metropolis" w:cs="Metropolis"/>
+          <w:color w:val="000000"/>
+        </w:rPr>
+        <w:t>Esta proposta tem validade de 90 dias.</w:t>
+      </w:r>
+    </w:p>
+    <w:p>
+      <w:pPr>
+        <w:pBdr>
+          <w:top w:val="nil"/>
+          <w:left w:val="nil"/>
+          <w:bottom w:val="nil"/>
+          <w:right w:val="nil"/>
+          <w:between w:val="nil"/>
+        </w:pBdr>
+        <w:spacing w:after="0" w:line="360" w:lineRule="auto"/>
+        <w:jc w:val="both"/>
+        <w:rPr>
+          <w:rFonts w:ascii="Metropolis" w:eastAsia="Metropolis" w:hAnsi="Metropolis" w:cs="Metropolis"/>
+          <w:color w:val="000000"/>
+        </w:rPr>
+      </w:pPr>
+    </w:p>
+    <w:p>
+      <w:pPr>
+        <w:spacing w:after="0" w:line="360" w:lineRule="auto"/>
+        <w:jc w:val="both"/>
+        <w:rPr>
+          <w:rFonts w:ascii="Metropolis" w:eastAsia="Metropolis" w:hAnsi="Metropolis" w:cs="Metropolis"/>
+          <w:b/>
+        </w:rPr>
+      </w:pPr>
+    </w:p>
+    <w:p>
+      <w:pPr>
+        <w:spacing w:after="0" w:line="360" w:lineRule="auto"/>
+        <w:jc w:val="both"/>
+        <w:rPr>
+          <w:rFonts w:ascii="Metropolis" w:eastAsia="Metropolis" w:hAnsi="Metropolis" w:cs="Metropolis"/>
+          <w:b/>
+        </w:rPr>
+      </w:pPr>
+      <w:r>
+        <w:rPr>
+          <w:rFonts w:ascii="Metropolis" w:eastAsia="Metropolis" w:hAnsi="Metropolis" w:cs="Metropolis"/>
+          <w:b/>
+        </w:rPr>
+        <w:t>Data do aceite da proposta: ______________________</w:t>
       </w:r>
     </w:p>
     <w:p>

</xml_diff>

<commit_message>
fix: corrige alterações solicitadas dia 07/10
</commit_message>
<xml_diff>
--- a/app/templates/docx/proposta_tecnica_comercial.docx
+++ b/app/templates/docx/proposta_tecnica_comercial.docx
@@ -4977,8 +4977,8 @@
       <w:r>
         <w:rPr>
           <w:rFonts w:ascii="Metropolis" w:eastAsia="Metropolis" w:hAnsi="Metropolis" w:cs="Metropolis"/>
-          <w:color w:val="000000"/>
           <w:b/>
+          <w:color w:val="000000"/>
         </w:rPr>
         <w:t>PAPYRUS</w:t>
       </w:r>
@@ -4992,8 +4992,8 @@
       <w:r>
         <w:rPr>
           <w:rFonts w:ascii="Metropolis" w:eastAsia="Metropolis" w:hAnsi="Metropolis" w:cs="Metropolis"/>
-          <w:color w:val="000000"/>
           <w:b/>
+          <w:color w:val="000000"/>
         </w:rPr>
         <w:t>PAPYRUS</w:t>
       </w:r>
@@ -6666,8 +6666,8 @@
       <w:r>
         <w:rPr>
           <w:rFonts w:ascii="Metropolis" w:eastAsia="Metropolis" w:hAnsi="Metropolis" w:cs="Metropolis"/>
-          <w:color w:val="000000"/>
           <w:b/>
+          <w:color w:val="000000"/>
         </w:rPr>
         <w:t>PAPYRUS</w:t>
       </w:r>
@@ -7580,9 +7580,9 @@
                           <w:r>
                             <w:rPr>
                               <w:rFonts w:ascii="Metropolis" w:eastAsia="Metropolis" w:hAnsi="Metropolis" w:cs="Metropolis"/>
+                              <w:noProof/>
                               <w:color w:val="0070C0"/>
                               <w:sz w:val="20"/>
-                              <w:noProof/>
                             </w:rPr>
                             <w:t>1</w:t>
                           </w:r>
@@ -7652,9 +7652,9 @@
                     <w:r>
                       <w:rPr>
                         <w:rFonts w:ascii="Metropolis" w:eastAsia="Metropolis" w:hAnsi="Metropolis" w:cs="Metropolis"/>
+                        <w:noProof/>
                         <w:color w:val="0070C0"/>
                         <w:sz w:val="20"/>
-                        <w:noProof/>
                       </w:rPr>
                       <w:t>1</w:t>
                     </w:r>
@@ -8071,9 +8071,9 @@
                           <w:r>
                             <w:rPr>
                               <w:rFonts w:ascii="Metropolis" w:eastAsia="Metropolis" w:hAnsi="Metropolis" w:cs="Metropolis"/>
+                              <w:noProof/>
                               <w:color w:val="0070C0"/>
                               <w:sz w:val="20"/>
-                              <w:noProof/>
                             </w:rPr>
                             <w:t>1</w:t>
                           </w:r>
@@ -8143,9 +8143,9 @@
                     <w:r>
                       <w:rPr>
                         <w:rFonts w:ascii="Metropolis" w:eastAsia="Metropolis" w:hAnsi="Metropolis" w:cs="Metropolis"/>
+                        <w:noProof/>
                         <w:color w:val="0070C0"/>
                         <w:sz w:val="20"/>
-                        <w:noProof/>
                       </w:rPr>
                       <w:t>1</w:t>
                     </w:r>

</xml_diff>

<commit_message>
fix: corrige mensagem solicitada no docx
</commit_message>
<xml_diff>
--- a/app/templates/docx/proposta_tecnica_comercial.docx
+++ b/app/templates/docx/proposta_tecnica_comercial.docx
@@ -6616,6 +6616,30 @@
         </w:tc>
       </w:tr>
     </w:tbl>
+    <w:p>
+      <w:pPr>
+        <w:pBdr>
+          <w:top w:val="nil"/>
+          <w:left w:val="nil"/>
+          <w:bottom w:val="nil"/>
+          <w:right w:val="nil"/>
+          <w:between w:val="nil"/>
+        </w:pBdr>
+        <w:spacing w:before="240" w:after="0" w:line="360" w:lineRule="auto"/>
+        <w:jc w:val="both"/>
+        <w:rPr>
+          <w:rFonts w:ascii="Metropolis" w:eastAsia="Metropolis" w:hAnsi="Metropolis" w:cs="Metropolis"/>
+          <w:color w:val="000000"/>
+        </w:rPr>
+      </w:pPr>
+      <w:r>
+        <w:rPr>
+          <w:rFonts w:ascii="Metropolis" w:eastAsia="Metropolis" w:hAnsi="Metropolis" w:cs="Metropolis"/>
+          <w:color w:val="000000"/>
+        </w:rPr>
+        <w:t xml:space="preserve">{{RESSALVA_PRECO_ITENS}}</w:t>
+      </w:r>
+    </w:p>
     <w:p>
       <w:pPr>
         <w:pBdr>

</xml_diff>

<commit_message>
fix: corrige bug de projetos
</commit_message>
<xml_diff>
--- a/app/templates/docx/proposta_tecnica_comercial.docx
+++ b/app/templates/docx/proposta_tecnica_comercial.docx
@@ -7815,7 +7815,7 @@
               <wp:extent cx="970915" cy="270510"/>
               <wp:effectExtent b="0" l="0" r="0" t="0"/>
               <wp:wrapNone/>
-              <wp:docPr id="195" name="image8.png"/>
+              <wp:docPr id="205" name="image8.png"/>
               <a:graphic>
                 <a:graphicData uri="http://schemas.openxmlformats.org/drawingml/2006/picture">
                   <pic:pic>
@@ -7893,7 +7893,7 @@
               <wp:extent cx="5650230" cy="1414145"/>
               <wp:effectExtent l="0" t="0" r="0" b="0"/>
               <wp:wrapNone/>
-              <wp:docPr id="196" name="Retângulo 196"/>
+              <wp:docPr id="216" name="Retângulo 196"/>
               <wp:cNvGraphicFramePr/>
               <a:graphic xmlns:a="http://schemas.openxmlformats.org/drawingml/2006/main">
                 <a:graphicData uri="http://schemas.microsoft.com/office/word/2010/wordprocessingShape">
@@ -7983,7 +7983,7 @@
           <wp:extent cx="361950" cy="361950"/>
           <wp:effectExtent l="0" t="0" r="0" b="0"/>
           <wp:wrapNone/>
-          <wp:docPr id="199" name="image3.png"/>
+          <wp:docPr id="219" name="image3.png"/>
           <wp:cNvGraphicFramePr/>
           <a:graphic xmlns:a="http://schemas.openxmlformats.org/drawingml/2006/main">
             <a:graphicData uri="http://schemas.openxmlformats.org/drawingml/2006/picture">
@@ -8033,7 +8033,7 @@
               <wp:extent cx="5650230" cy="1414145"/>
               <wp:effectExtent l="0" t="0" r="0" b="0"/>
               <wp:wrapNone/>
-              <wp:docPr id="197" name="Retângulo 197"/>
+              <wp:docPr id="217" name="Retângulo 197"/>
               <wp:cNvGraphicFramePr/>
               <a:graphic xmlns:a="http://schemas.openxmlformats.org/drawingml/2006/main">
                 <a:graphicData uri="http://schemas.microsoft.com/office/word/2010/wordprocessingShape">
@@ -8253,7 +8253,7 @@
               <wp:extent cx="970915" cy="270510"/>
               <wp:effectExtent l="0" t="0" r="0" b="0"/>
               <wp:wrapNone/>
-              <wp:docPr id="195" name="Retângulo 195"/>
+              <wp:docPr id="215" name="Retângulo 195"/>
               <wp:cNvGraphicFramePr/>
               <a:graphic xmlns:a="http://schemas.openxmlformats.org/drawingml/2006/main">
                 <a:graphicData uri="http://schemas.microsoft.com/office/word/2010/wordprocessingShape">
@@ -8306,7 +8306,7 @@
               <wp:extent cx="970915" cy="270510"/>
               <wp:effectExtent b="0" l="0" r="0" t="0"/>
               <wp:wrapNone/>
-              <wp:docPr id="195" name="image8.png"/>
+              <wp:docPr id="225" name="image8.png"/>
               <a:graphic>
                 <a:graphicData uri="http://schemas.openxmlformats.org/drawingml/2006/picture">
                   <pic:pic>

</xml_diff>